<commit_message>
Update CRC cards and assignment4 folder structure
</commit_message>
<xml_diff>
--- a/src/org/howard/edu/lsp/assignment4/doc/CRC Cards.docx
+++ b/src/org/howard/edu/lsp/assignment4/doc/CRC Cards.docx
@@ -12,7 +12,7 @@
     </w:p>
     <w:p>
       <w:r>
-        <w:t>Assignment 4 – Object Oriented Design</w:t>
+        <w:t>Assignment 4</w:t>
       </w:r>
     </w:p>
     <w:p>
@@ -909,10 +909,7 @@
         <w:t>Background</w:t>
       </w:r>
       <w:r>
-        <w:t xml:space="preserve"> reading was done on air traffic control systems </w:t>
-      </w:r>
-      <w:r>
-        <w:t>to understand typical</w:t>
+        <w:t xml:space="preserve"> reading was done on air traffic control systems to understand typical</w:t>
       </w:r>
       <w:r>
         <w:t xml:space="preserve"> </w:t>
@@ -12853,4 +12850,10 @@
     <ds:schemaRef ds:uri="http://schemas.openxmlformats.org/officeDocument/2006/bibliography"/>
   </ds:schemaRefs>
 </ds:datastoreItem>
+</file>
+
+<file path=docMetadata/LabelInfo.xml><?xml version="1.0" encoding="utf-8"?>
+<clbl:labelList xmlns:clbl="http://schemas.microsoft.com/office/2020/mipLabelMetadata">
+  <clbl:label id="{02ac0c07-b75f-46bf-9b13-3630ba94bb69}" enabled="0" method="" siteId="{02ac0c07-b75f-46bf-9b13-3630ba94bb69}" removed="1"/>
+</clbl:labelList>
 </file>
</xml_diff>